<commit_message>
fix: hapus kurawal dobel di placeholder Islam & Hindu
Diagnosis sebelumnya (commit f30a668) keliru: di Islam & Hindu, kurawal
placeholder tidak hilang tapi TERPECAH ke run terpisah — '{' + '{key}' + '}'
di tiga <w:t> berbeda. Akibatnya:
- Substitusi .replace(/{key}/) mengisi run tengah, menyisakan '{' dan '}'
  liar -> output tampil '{Ahmad Fauzi}', '{Penata Muda}', dst.

Perbaikan: kosongkan run lone-brace ('{' dan '}') di sekeliling placeholder
kontigu, menyisakan satu {key} bersih per lokasi. Spasi pada run '} '
dipertahankan.

Terverifikasi END-TO-END lewat API sungguhan (bukan hanya cek XML):
upload Excel 5 baris -> 5 PDF ke Minio -> render PDF Islam dari Minio bersih
tanpa kurawal, nama/NIP/jabatan terisi benar, Arial, 1 halaman.

Co-Authored-By: Claude Opus 4.8 <noreply@anthropic.com>
</commit_message>
<xml_diff>
--- a/templates/CEK/Hindu.docx
+++ b/templates/CEK/Hindu.docx
@@ -1269,7 +1269,7 @@
           <w:szCs w:val="22"/>
           <w:shd w:val="clear" w:color="auto" w:fill="FFFFFF"/>
         </w:rPr>
-        <w:t>{</w:t>
+        <w:t/>
       </w:r>
       <w:proofErr w:type="spellStart"/>
       <w:r>
@@ -1289,7 +1289,7 @@
           <w:szCs w:val="22"/>
           <w:shd w:val="clear" w:color="auto" w:fill="FFFFFF"/>
         </w:rPr>
-        <w:t>}</w:t>
+        <w:t/>
       </w:r>
       <w:r>
         <w:rPr>
@@ -1326,7 +1326,7 @@
           <w:szCs w:val="22"/>
           <w:shd w:val="clear" w:color="auto" w:fill="FFFFFF"/>
         </w:rPr>
-        <w:t>{</w:t>
+        <w:t/>
       </w:r>
       <w:proofErr w:type="spellStart"/>
       <w:r>
@@ -1346,7 +1346,7 @@
           <w:szCs w:val="22"/>
           <w:shd w:val="clear" w:color="auto" w:fill="FFFFFF"/>
         </w:rPr>
-        <w:t>}</w:t>
+        <w:t/>
       </w:r>
       <w:r>
         <w:rPr>
@@ -1403,7 +1403,7 @@
           <w:szCs w:val="22"/>
           <w:shd w:val="clear" w:color="auto" w:fill="FFFFFF"/>
         </w:rPr>
-        <w:t>{</w:t>
+        <w:t/>
       </w:r>
       <w:proofErr w:type="spellStart"/>
       <w:r>
@@ -1423,7 +1423,7 @@
           <w:szCs w:val="22"/>
           <w:shd w:val="clear" w:color="auto" w:fill="FFFFFF"/>
         </w:rPr>
-        <w:t>}</w:t>
+        <w:t/>
       </w:r>
     </w:p>
     <w:p>
@@ -2712,7 +2712,7 @@
                 <w:u w:val="single"/>
                 <w:shd w:val="clear" w:color="auto" w:fill="FFFFFF"/>
               </w:rPr>
-              <w:t>{</w:t>
+              <w:t/>
             </w:r>
             <w:proofErr w:type="spellStart"/>
             <w:r>
@@ -2734,7 +2734,7 @@
                 <w:u w:val="single"/>
                 <w:shd w:val="clear" w:color="auto" w:fill="FFFFFF"/>
               </w:rPr>
-              <w:t>}</w:t>
+              <w:t/>
             </w:r>
           </w:p>
           <w:p>
@@ -2787,7 +2787,7 @@
                 <w:szCs w:val="22"/>
                 <w:shd w:val="clear" w:color="auto" w:fill="FFFFFF"/>
               </w:rPr>
-              <w:t>{</w:t>
+              <w:t/>
             </w:r>
             <w:proofErr w:type="spellStart"/>
             <w:r>
@@ -2807,7 +2807,7 @@
                 <w:szCs w:val="22"/>
                 <w:shd w:val="clear" w:color="auto" w:fill="FFFFFF"/>
               </w:rPr>
-              <w:t>}</w:t>
+              <w:t/>
             </w:r>
           </w:p>
         </w:tc>

</xml_diff>